<commit_message>
feat: Add minimal complex DOCX fixtures for advanced features
- Added 4 minimal DOCX fixtures (<5KB each) in tests/fixtures/uploads/complex/
- tracked_changes.docx (1.8KB): Contains w:ins elements for insertions
- comments.docx (2.6KB): Contains w:comment elements with ranges
- hyperlinks.docx (2.0KB): Contains w:hyperlink elements with external links
- fields.docx (1.9KB): Contains w:fldSimple elements for fields
- All fixtures verified to contain correct XML elements as specified
- Added comprehensive README with XML snippets and verification commands
- Created tests/create_complex_fixtures.py for generating minimal fixtures

🤖 Generated with [Claude Code](https://claude.ai/code)

Co-Authored-By: Claude <noreply@anthropic.com>
</commit_message>
<xml_diff>
--- a/tests/fixtures/uploads/complex/comments.docx
+++ b/tests/fixtures/uploads/complex/comments.docx
@@ -5,16 +5,11 @@
     <w:p>
       <w:commentRangeStart w:id="0"/>
       <w:r>
-        <w:t>Text with comment.</w:t>
+        <w:t>This text has a comment</w:t>
       </w:r>
+      <w:commentRangeEnd w:id="0"/>
       <w:r>
         <w:commentReference w:id="0"/>
-      </w:r>
-      <w:commentRangeEnd w:id="0"/>
-    </w:p>
-    <w:p>
-      <w:r>
-        <w:t>Normal text.</w:t>
       </w:r>
     </w:p>
   </w:body>

</xml_diff>